<commit_message>
Capteur chaudière Sdb : fabrication des câbles vers les modules
Dossier, § 7.7 : alimentation du TCS34725 par VIN (sa broche 3V3 est une
sortie), torsadage des fils I2C, méthode (câbles JST-XH sertis + soudure
côté module, contrôle au multimètre) et tableaux de câblage J1 / J2.

Co-Authored-By: Claude Opus 5.5 <noreply@anthropic.com>
</commit_message>
<xml_diff>
--- a/Capteur/pcb/Capteur chaudiere Sdb/CapteurChaudiereSdb.docx
+++ b/Capteur/pcb/Capteur chaudiere Sdb/CapteurChaudiereSdb.docx
@@ -5789,7 +5789,7 @@
         <w:t xml:space="preserve">VIN</w:t>
       </w:r>
       <w:r>
-        <w:t xml:space="preserve"> du TCS34725 (pas sa broche 3V3) ; torsader SDA/GND et SCL/3V3.</w:t>
+        <w:t xml:space="preserve"> du TCS34725 (pas sa broche 3V3) ; torsader SDA/GND et SCL/3V3 (§ 7.7).</w:t>
       </w:r>
     </w:p>
     <w:p>
@@ -5804,6 +5804,1147 @@
         <w:t xml:space="preserve">☐ Tracé du boîtier imprimé (hauteur intérieure ≥ 25 mm, trous USB-C et LED côté droit, passe-fils, DHT20 sur la paroi).</w:t>
       </w:r>
     </w:p>
+    <w:p>
+      <w:pPr>
+        <w:pStyle w:val="Heading2"/>
+        <w:keepNext/>
+      </w:pPr>
+      <w:r>
+        <w:t xml:space="preserve">7.7 Câbles vers les modules</w:t>
+      </w:r>
+    </w:p>
+    <w:p>
+      <w:pPr>
+        <w:spacing w:after="120"/>
+      </w:pPr>
+      <w:r>
+        <w:rPr>
+          <w:b/>
+          <w:bCs/>
+        </w:rPr>
+        <w:t xml:space="preserve">Pourquoi VIN</w:t>
+      </w:r>
+      <w:r>
+        <w:t xml:space="preserve"> : le TCS34725 s'alimente par </w:t>
+      </w:r>
+      <w:r>
+        <w:rPr>
+          <w:b/>
+          <w:bCs/>
+        </w:rPr>
+        <w:t xml:space="preserve">VIN</w:t>
+      </w:r>
+      <w:r>
+        <w:t xml:space="preserve"> (entrée de son régulateur et de son adaptateur de niveau I2C, comme le préconise Adafruit) ; sa broche </w:t>
+      </w:r>
+      <w:r>
+        <w:rPr>
+          <w:b/>
+          <w:bCs/>
+        </w:rPr>
+        <w:t xml:space="preserve">3V3 est une sortie</w:t>
+      </w:r>
+      <w:r>
+        <w:t xml:space="preserve">. Le fil de la broche 1 de J2 va donc sur VIN, pas sur 3V3.</w:t>
+      </w:r>
+    </w:p>
+    <w:p>
+      <w:pPr>
+        <w:spacing w:after="120"/>
+      </w:pPr>
+      <w:r>
+        <w:rPr>
+          <w:b/>
+          <w:bCs/>
+        </w:rPr>
+        <w:t xml:space="preserve">Pourquoi torsader</w:t>
+      </w:r>
+      <w:r>
+        <w:t xml:space="preserve"> : le bus I2C n'est pas fait pour de longs fils (≈ 30 cm au total ici). En torsadant les fils deux par deux (quelques tours par centimètre), chaque signal voyage collé à son fil de retour : il capte moins de parasites et gêne moins son voisin. Précaution gratuite contre des erreurs de lecture intermittentes : </w:t>
+      </w:r>
+      <w:r>
+        <w:rPr>
+          <w:b/>
+          <w:bCs/>
+        </w:rPr>
+        <w:t xml:space="preserve">SDA avec GND</w:t>
+      </w:r>
+      <w:r>
+        <w:t xml:space="preserve">, </w:t>
+      </w:r>
+      <w:r>
+        <w:rPr>
+          <w:b/>
+          <w:bCs/>
+        </w:rPr>
+        <w:t xml:space="preserve">SCL avec l'alimentation</w:t>
+      </w:r>
+      <w:r>
+        <w:t xml:space="preserve"> (VIN ou +).</w:t>
+      </w:r>
+    </w:p>
+    <w:p>
+      <w:pPr>
+        <w:spacing w:after="120"/>
+      </w:pPr>
+      <w:r>
+        <w:rPr>
+          <w:b/>
+          <w:bCs/>
+        </w:rPr>
+        <w:t xml:space="preserve">Méthode conseillée : câbles JST-XH déjà sertis + soudure côté module</w:t>
+      </w:r>
+    </w:p>
+    <w:p>
+      <w:pPr>
+        <w:pStyle w:val="ListParagraph"/>
+        <w:numPr>
+          <w:ilvl w:val="0"/>
+          <w:numId w:val="3"/>
+        </w:numPr>
+      </w:pPr>
+      <w:r>
+        <w:t xml:space="preserve">Acheter des câbles </w:t>
+      </w:r>
+      <w:r>
+        <w:rPr>
+          <w:b/>
+          <w:bCs/>
+        </w:rPr>
+        <w:t xml:space="preserve">JST-XH pas de 2,5 mm</w:t>
+      </w:r>
+      <w:r>
+        <w:t xml:space="preserve">, déjà sertis (connecteur femelle d'un côté, fils nus de l'autre), longueur 20 cm : un 5 broches (TCS34725) et un 4 broches (DHT20).</w:t>
+      </w:r>
+    </w:p>
+    <w:p>
+      <w:pPr>
+        <w:pStyle w:val="ListParagraph"/>
+        <w:numPr>
+          <w:ilvl w:val="0"/>
+          <w:numId w:val="3"/>
+        </w:numPr>
+      </w:pPr>
+      <w:r>
+        <w:t xml:space="preserve">Repérer le fil de la </w:t>
+      </w:r>
+      <w:r>
+        <w:rPr>
+          <w:b/>
+          <w:bCs/>
+        </w:rPr>
+        <w:t xml:space="preserve">broche 1</w:t>
+      </w:r>
+      <w:r>
+        <w:t xml:space="preserve"> du connecteur : sur la carte, la broche 1 de J2 est à droite, sous « VIN ».</w:t>
+      </w:r>
+    </w:p>
+    <w:p>
+      <w:pPr>
+        <w:pStyle w:val="ListParagraph"/>
+        <w:numPr>
+          <w:ilvl w:val="0"/>
+          <w:numId w:val="3"/>
+        </w:numPr>
+      </w:pPr>
+      <w:r>
+        <w:t xml:space="preserve">Torsader les fils deux par deux (voir ci-dessus).</w:t>
+      </w:r>
+    </w:p>
+    <w:p>
+      <w:pPr>
+        <w:pStyle w:val="ListParagraph"/>
+        <w:numPr>
+          <w:ilvl w:val="0"/>
+          <w:numId w:val="3"/>
+        </w:numPr>
+      </w:pPr>
+      <w:r>
+        <w:rPr>
+          <w:b/>
+          <w:bCs/>
+        </w:rPr>
+        <w:t xml:space="preserve">Souder</w:t>
+      </w:r>
+      <w:r>
+        <w:t xml:space="preserve"> les fils directement dans les trous du module (plus fiable qu'un connecteur Dupont dans l'humidité d'une salle de bain).</w:t>
+      </w:r>
+    </w:p>
+    <w:p>
+      <w:pPr>
+        <w:pStyle w:val="ListParagraph"/>
+        <w:numPr>
+          <w:ilvl w:val="0"/>
+          <w:numId w:val="3"/>
+        </w:numPr>
+      </w:pPr>
+      <w:r>
+        <w:t xml:space="preserve">Protéger les soudures : gaine thermorétractable ou point de colle chaude.</w:t>
+      </w:r>
+    </w:p>
+    <w:p>
+      <w:pPr>
+        <w:pStyle w:val="ListParagraph"/>
+        <w:numPr>
+          <w:ilvl w:val="0"/>
+          <w:numId w:val="3"/>
+        </w:numPr>
+      </w:pPr>
+      <w:r>
+        <w:rPr>
+          <w:b/>
+          <w:bCs/>
+        </w:rPr>
+        <w:t xml:space="preserve">Contrôler au multimètre</w:t>
+      </w:r>
+      <w:r>
+        <w:t xml:space="preserve"> (continuité) avant de brancher : chaque broche du connecteur sonne avec la bonne pastille du module, et aucune avec sa voisine.</w:t>
+      </w:r>
+    </w:p>
+    <w:p>
+      <w:pPr>
+        <w:spacing w:after="120"/>
+      </w:pPr>
+      <w:r>
+        <w:t xml:space="preserve">Variante : sertir soi-même (boîtiers XHP-4 / XHP-5, contacts SXH-001T-P0.6, pince adaptée type IWISS SN-01BM ou Engineer PA-09, fil AWG 26–28) ; ne vaut le coup que pour beaucoup de câbles. Si le module porte déjà une barrette mâle, des fils à connecteur Dupont femelle conviennent pour les essais, moins pour la durée.</w:t>
+      </w:r>
+    </w:p>
+    <w:p>
+      <w:pPr>
+        <w:spacing w:after="120"/>
+      </w:pPr>
+      <w:r>
+        <w:t xml:space="preserve">Câble J2 → TCS34725 (JST-XH 5 broches) :</w:t>
+      </w:r>
+    </w:p>
+    <w:tbl>
+      <w:tblPr>
+        <w:tblW w:type="dxa" w:w="9638"/>
+        <w:tblBorders>
+          <w:top w:val="single" w:color="auto" w:sz="4"/>
+          <w:left w:val="single" w:color="auto" w:sz="4"/>
+          <w:bottom w:val="single" w:color="auto" w:sz="4"/>
+          <w:right w:val="single" w:color="auto" w:sz="4"/>
+          <w:insideH w:val="single" w:color="auto" w:sz="4"/>
+          <w:insideV w:val="single" w:color="auto" w:sz="4"/>
+        </w:tblBorders>
+      </w:tblPr>
+      <w:tblGrid>
+        <w:gridCol w:w="559"/>
+        <w:gridCol w:w="7403"/>
+        <w:gridCol w:w="1676"/>
+      </w:tblGrid>
+      <w:tr>
+        <w:trPr>
+          <w:tblHeader/>
+        </w:trPr>
+        <w:tc>
+          <w:tcPr>
+            <w:tcW w:type="dxa" w:w="559"/>
+            <w:tcBorders>
+              <w:top w:val="single" w:color="999999" w:sz="4"/>
+              <w:left w:val="single" w:color="999999" w:sz="4"/>
+              <w:bottom w:val="single" w:color="999999" w:sz="4"/>
+              <w:right w:val="single" w:color="999999" w:sz="4"/>
+            </w:tcBorders>
+            <w:shd w:fill="D9E2F3" w:val="clear"/>
+            <w:tcMar>
+              <w:top w:type="dxa" w:w="60"/>
+              <w:left w:type="dxa" w:w="100"/>
+              <w:bottom w:type="dxa" w:w="60"/>
+              <w:right w:type="dxa" w:w="100"/>
+            </w:tcMar>
+          </w:tcPr>
+          <w:p>
+            <w:r>
+              <w:rPr>
+                <w:b/>
+                <w:bCs/>
+              </w:rPr>
+              <w:t xml:space="preserve">J2</w:t>
+            </w:r>
+          </w:p>
+        </w:tc>
+        <w:tc>
+          <w:tcPr>
+            <w:tcW w:type="dxa" w:w="7403"/>
+            <w:tcBorders>
+              <w:top w:val="single" w:color="999999" w:sz="4"/>
+              <w:left w:val="single" w:color="999999" w:sz="4"/>
+              <w:bottom w:val="single" w:color="999999" w:sz="4"/>
+              <w:right w:val="single" w:color="999999" w:sz="4"/>
+            </w:tcBorders>
+            <w:shd w:fill="D9E2F3" w:val="clear"/>
+            <w:tcMar>
+              <w:top w:type="dxa" w:w="60"/>
+              <w:left w:type="dxa" w:w="100"/>
+              <w:bottom w:type="dxa" w:w="60"/>
+              <w:right w:type="dxa" w:w="100"/>
+            </w:tcMar>
+          </w:tcPr>
+          <w:p>
+            <w:r>
+              <w:rPr>
+                <w:b/>
+                <w:bCs/>
+              </w:rPr>
+              <w:t xml:space="preserve">Module</w:t>
+            </w:r>
+          </w:p>
+        </w:tc>
+        <w:tc>
+          <w:tcPr>
+            <w:tcW w:type="dxa" w:w="1676"/>
+            <w:tcBorders>
+              <w:top w:val="single" w:color="999999" w:sz="4"/>
+              <w:left w:val="single" w:color="999999" w:sz="4"/>
+              <w:bottom w:val="single" w:color="999999" w:sz="4"/>
+              <w:right w:val="single" w:color="999999" w:sz="4"/>
+            </w:tcBorders>
+            <w:shd w:fill="D9E2F3" w:val="clear"/>
+            <w:tcMar>
+              <w:top w:type="dxa" w:w="60"/>
+              <w:left w:type="dxa" w:w="100"/>
+              <w:bottom w:type="dxa" w:w="60"/>
+              <w:right w:type="dxa" w:w="100"/>
+            </w:tcMar>
+          </w:tcPr>
+          <w:p>
+            <w:r>
+              <w:rPr>
+                <w:b/>
+                <w:bCs/>
+              </w:rPr>
+              <w:t xml:space="preserve">Torsadé avec</w:t>
+            </w:r>
+          </w:p>
+        </w:tc>
+      </w:tr>
+      <w:tr>
+        <w:trPr>
+          <w:tblHeader w:val="off"/>
+        </w:trPr>
+        <w:tc>
+          <w:tcPr>
+            <w:tcW w:type="dxa" w:w="559"/>
+            <w:tcBorders>
+              <w:top w:val="single" w:color="999999" w:sz="4"/>
+              <w:left w:val="single" w:color="999999" w:sz="4"/>
+              <w:bottom w:val="single" w:color="999999" w:sz="4"/>
+              <w:right w:val="single" w:color="999999" w:sz="4"/>
+            </w:tcBorders>
+            <w:tcMar>
+              <w:top w:type="dxa" w:w="60"/>
+              <w:left w:type="dxa" w:w="100"/>
+              <w:bottom w:type="dxa" w:w="60"/>
+              <w:right w:type="dxa" w:w="100"/>
+            </w:tcMar>
+          </w:tcPr>
+          <w:p>
+            <w:r>
+              <w:t xml:space="preserve">1</w:t>
+            </w:r>
+          </w:p>
+        </w:tc>
+        <w:tc>
+          <w:tcPr>
+            <w:tcW w:type="dxa" w:w="7403"/>
+            <w:tcBorders>
+              <w:top w:val="single" w:color="999999" w:sz="4"/>
+              <w:left w:val="single" w:color="999999" w:sz="4"/>
+              <w:bottom w:val="single" w:color="999999" w:sz="4"/>
+              <w:right w:val="single" w:color="999999" w:sz="4"/>
+            </w:tcBorders>
+            <w:tcMar>
+              <w:top w:type="dxa" w:w="60"/>
+              <w:left w:type="dxa" w:w="100"/>
+              <w:bottom w:type="dxa" w:w="60"/>
+              <w:right w:type="dxa" w:w="100"/>
+            </w:tcMar>
+          </w:tcPr>
+          <w:p>
+            <w:r>
+              <w:t xml:space="preserve">VIN</w:t>
+            </w:r>
+          </w:p>
+        </w:tc>
+        <w:tc>
+          <w:tcPr>
+            <w:tcW w:type="dxa" w:w="1676"/>
+            <w:tcBorders>
+              <w:top w:val="single" w:color="999999" w:sz="4"/>
+              <w:left w:val="single" w:color="999999" w:sz="4"/>
+              <w:bottom w:val="single" w:color="999999" w:sz="4"/>
+              <w:right w:val="single" w:color="999999" w:sz="4"/>
+            </w:tcBorders>
+            <w:tcMar>
+              <w:top w:type="dxa" w:w="60"/>
+              <w:left w:type="dxa" w:w="100"/>
+              <w:bottom w:type="dxa" w:w="60"/>
+              <w:right w:type="dxa" w:w="100"/>
+            </w:tcMar>
+          </w:tcPr>
+          <w:p>
+            <w:r>
+              <w:t xml:space="preserve">SCL</w:t>
+            </w:r>
+          </w:p>
+        </w:tc>
+      </w:tr>
+      <w:tr>
+        <w:trPr>
+          <w:tblHeader w:val="off"/>
+        </w:trPr>
+        <w:tc>
+          <w:tcPr>
+            <w:tcW w:type="dxa" w:w="559"/>
+            <w:tcBorders>
+              <w:top w:val="single" w:color="999999" w:sz="4"/>
+              <w:left w:val="single" w:color="999999" w:sz="4"/>
+              <w:bottom w:val="single" w:color="999999" w:sz="4"/>
+              <w:right w:val="single" w:color="999999" w:sz="4"/>
+            </w:tcBorders>
+            <w:tcMar>
+              <w:top w:type="dxa" w:w="60"/>
+              <w:left w:type="dxa" w:w="100"/>
+              <w:bottom w:type="dxa" w:w="60"/>
+              <w:right w:type="dxa" w:w="100"/>
+            </w:tcMar>
+          </w:tcPr>
+          <w:p>
+            <w:r>
+              <w:t xml:space="preserve">2</w:t>
+            </w:r>
+          </w:p>
+        </w:tc>
+        <w:tc>
+          <w:tcPr>
+            <w:tcW w:type="dxa" w:w="7403"/>
+            <w:tcBorders>
+              <w:top w:val="single" w:color="999999" w:sz="4"/>
+              <w:left w:val="single" w:color="999999" w:sz="4"/>
+              <w:bottom w:val="single" w:color="999999" w:sz="4"/>
+              <w:right w:val="single" w:color="999999" w:sz="4"/>
+            </w:tcBorders>
+            <w:tcMar>
+              <w:top w:type="dxa" w:w="60"/>
+              <w:left w:type="dxa" w:w="100"/>
+              <w:bottom w:type="dxa" w:w="60"/>
+              <w:right w:type="dxa" w:w="100"/>
+            </w:tcMar>
+          </w:tcPr>
+          <w:p>
+            <w:r>
+              <w:t xml:space="preserve">GND</w:t>
+            </w:r>
+          </w:p>
+        </w:tc>
+        <w:tc>
+          <w:tcPr>
+            <w:tcW w:type="dxa" w:w="1676"/>
+            <w:tcBorders>
+              <w:top w:val="single" w:color="999999" w:sz="4"/>
+              <w:left w:val="single" w:color="999999" w:sz="4"/>
+              <w:bottom w:val="single" w:color="999999" w:sz="4"/>
+              <w:right w:val="single" w:color="999999" w:sz="4"/>
+            </w:tcBorders>
+            <w:tcMar>
+              <w:top w:type="dxa" w:w="60"/>
+              <w:left w:type="dxa" w:w="100"/>
+              <w:bottom w:type="dxa" w:w="60"/>
+              <w:right w:type="dxa" w:w="100"/>
+            </w:tcMar>
+          </w:tcPr>
+          <w:p>
+            <w:r>
+              <w:t xml:space="preserve">SDA</w:t>
+            </w:r>
+          </w:p>
+        </w:tc>
+      </w:tr>
+      <w:tr>
+        <w:trPr>
+          <w:tblHeader w:val="off"/>
+        </w:trPr>
+        <w:tc>
+          <w:tcPr>
+            <w:tcW w:type="dxa" w:w="559"/>
+            <w:tcBorders>
+              <w:top w:val="single" w:color="999999" w:sz="4"/>
+              <w:left w:val="single" w:color="999999" w:sz="4"/>
+              <w:bottom w:val="single" w:color="999999" w:sz="4"/>
+              <w:right w:val="single" w:color="999999" w:sz="4"/>
+            </w:tcBorders>
+            <w:tcMar>
+              <w:top w:type="dxa" w:w="60"/>
+              <w:left w:type="dxa" w:w="100"/>
+              <w:bottom w:type="dxa" w:w="60"/>
+              <w:right w:type="dxa" w:w="100"/>
+            </w:tcMar>
+          </w:tcPr>
+          <w:p>
+            <w:r>
+              <w:t xml:space="preserve">3</w:t>
+            </w:r>
+          </w:p>
+        </w:tc>
+        <w:tc>
+          <w:tcPr>
+            <w:tcW w:type="dxa" w:w="7403"/>
+            <w:tcBorders>
+              <w:top w:val="single" w:color="999999" w:sz="4"/>
+              <w:left w:val="single" w:color="999999" w:sz="4"/>
+              <w:bottom w:val="single" w:color="999999" w:sz="4"/>
+              <w:right w:val="single" w:color="999999" w:sz="4"/>
+            </w:tcBorders>
+            <w:tcMar>
+              <w:top w:type="dxa" w:w="60"/>
+              <w:left w:type="dxa" w:w="100"/>
+              <w:bottom w:type="dxa" w:w="60"/>
+              <w:right w:type="dxa" w:w="100"/>
+            </w:tcMar>
+          </w:tcPr>
+          <w:p>
+            <w:r>
+              <w:t xml:space="preserve">SCL</w:t>
+            </w:r>
+          </w:p>
+        </w:tc>
+        <w:tc>
+          <w:tcPr>
+            <w:tcW w:type="dxa" w:w="1676"/>
+            <w:tcBorders>
+              <w:top w:val="single" w:color="999999" w:sz="4"/>
+              <w:left w:val="single" w:color="999999" w:sz="4"/>
+              <w:bottom w:val="single" w:color="999999" w:sz="4"/>
+              <w:right w:val="single" w:color="999999" w:sz="4"/>
+            </w:tcBorders>
+            <w:tcMar>
+              <w:top w:type="dxa" w:w="60"/>
+              <w:left w:type="dxa" w:w="100"/>
+              <w:bottom w:type="dxa" w:w="60"/>
+              <w:right w:type="dxa" w:w="100"/>
+            </w:tcMar>
+          </w:tcPr>
+          <w:p>
+            <w:r>
+              <w:t xml:space="preserve">VIN</w:t>
+            </w:r>
+          </w:p>
+        </w:tc>
+      </w:tr>
+      <w:tr>
+        <w:trPr>
+          <w:tblHeader w:val="off"/>
+        </w:trPr>
+        <w:tc>
+          <w:tcPr>
+            <w:tcW w:type="dxa" w:w="559"/>
+            <w:tcBorders>
+              <w:top w:val="single" w:color="999999" w:sz="4"/>
+              <w:left w:val="single" w:color="999999" w:sz="4"/>
+              <w:bottom w:val="single" w:color="999999" w:sz="4"/>
+              <w:right w:val="single" w:color="999999" w:sz="4"/>
+            </w:tcBorders>
+            <w:tcMar>
+              <w:top w:type="dxa" w:w="60"/>
+              <w:left w:type="dxa" w:w="100"/>
+              <w:bottom w:type="dxa" w:w="60"/>
+              <w:right w:type="dxa" w:w="100"/>
+            </w:tcMar>
+          </w:tcPr>
+          <w:p>
+            <w:r>
+              <w:t xml:space="preserve">4</w:t>
+            </w:r>
+          </w:p>
+        </w:tc>
+        <w:tc>
+          <w:tcPr>
+            <w:tcW w:type="dxa" w:w="7403"/>
+            <w:tcBorders>
+              <w:top w:val="single" w:color="999999" w:sz="4"/>
+              <w:left w:val="single" w:color="999999" w:sz="4"/>
+              <w:bottom w:val="single" w:color="999999" w:sz="4"/>
+              <w:right w:val="single" w:color="999999" w:sz="4"/>
+            </w:tcBorders>
+            <w:tcMar>
+              <w:top w:type="dxa" w:w="60"/>
+              <w:left w:type="dxa" w:w="100"/>
+              <w:bottom w:type="dxa" w:w="60"/>
+              <w:right w:type="dxa" w:w="100"/>
+            </w:tcMar>
+          </w:tcPr>
+          <w:p>
+            <w:r>
+              <w:t xml:space="preserve">SDA</w:t>
+            </w:r>
+          </w:p>
+        </w:tc>
+        <w:tc>
+          <w:tcPr>
+            <w:tcW w:type="dxa" w:w="1676"/>
+            <w:tcBorders>
+              <w:top w:val="single" w:color="999999" w:sz="4"/>
+              <w:left w:val="single" w:color="999999" w:sz="4"/>
+              <w:bottom w:val="single" w:color="999999" w:sz="4"/>
+              <w:right w:val="single" w:color="999999" w:sz="4"/>
+            </w:tcBorders>
+            <w:tcMar>
+              <w:top w:type="dxa" w:w="60"/>
+              <w:left w:type="dxa" w:w="100"/>
+              <w:bottom w:type="dxa" w:w="60"/>
+              <w:right w:type="dxa" w:w="100"/>
+            </w:tcMar>
+          </w:tcPr>
+          <w:p>
+            <w:r>
+              <w:t xml:space="preserve">GND</w:t>
+            </w:r>
+          </w:p>
+        </w:tc>
+      </w:tr>
+      <w:tr>
+        <w:trPr>
+          <w:tblHeader w:val="off"/>
+        </w:trPr>
+        <w:tc>
+          <w:tcPr>
+            <w:tcW w:type="dxa" w:w="559"/>
+            <w:tcBorders>
+              <w:top w:val="single" w:color="999999" w:sz="4"/>
+              <w:left w:val="single" w:color="999999" w:sz="4"/>
+              <w:bottom w:val="single" w:color="999999" w:sz="4"/>
+              <w:right w:val="single" w:color="999999" w:sz="4"/>
+            </w:tcBorders>
+            <w:tcMar>
+              <w:top w:type="dxa" w:w="60"/>
+              <w:left w:type="dxa" w:w="100"/>
+              <w:bottom w:type="dxa" w:w="60"/>
+              <w:right w:type="dxa" w:w="100"/>
+            </w:tcMar>
+          </w:tcPr>
+          <w:p>
+            <w:r>
+              <w:t xml:space="preserve">5</w:t>
+            </w:r>
+          </w:p>
+        </w:tc>
+        <w:tc>
+          <w:tcPr>
+            <w:tcW w:type="dxa" w:w="7403"/>
+            <w:tcBorders>
+              <w:top w:val="single" w:color="999999" w:sz="4"/>
+              <w:left w:val="single" w:color="999999" w:sz="4"/>
+              <w:bottom w:val="single" w:color="999999" w:sz="4"/>
+              <w:right w:val="single" w:color="999999" w:sz="4"/>
+            </w:tcBorders>
+            <w:tcMar>
+              <w:top w:type="dxa" w:w="60"/>
+              <w:left w:type="dxa" w:w="100"/>
+              <w:bottom w:type="dxa" w:w="60"/>
+              <w:right w:type="dxa" w:w="100"/>
+            </w:tcMar>
+          </w:tcPr>
+          <w:p>
+            <w:r>
+              <w:t xml:space="preserve">LED (reliée à GND sur la carte : LED blanche éteinte)</w:t>
+            </w:r>
+          </w:p>
+        </w:tc>
+        <w:tc>
+          <w:tcPr>
+            <w:tcW w:type="dxa" w:w="1676"/>
+            <w:tcBorders>
+              <w:top w:val="single" w:color="999999" w:sz="4"/>
+              <w:left w:val="single" w:color="999999" w:sz="4"/>
+              <w:bottom w:val="single" w:color="999999" w:sz="4"/>
+              <w:right w:val="single" w:color="999999" w:sz="4"/>
+            </w:tcBorders>
+            <w:tcMar>
+              <w:top w:type="dxa" w:w="60"/>
+              <w:left w:type="dxa" w:w="100"/>
+              <w:bottom w:type="dxa" w:w="60"/>
+              <w:right w:type="dxa" w:w="100"/>
+            </w:tcMar>
+          </w:tcPr>
+          <w:p>
+            <w:r>
+              <w:t xml:space="preserve">—</w:t>
+            </w:r>
+          </w:p>
+        </w:tc>
+      </w:tr>
+      <w:tr>
+        <w:trPr>
+          <w:tblHeader w:val="off"/>
+        </w:trPr>
+        <w:tc>
+          <w:tcPr>
+            <w:tcW w:type="dxa" w:w="559"/>
+            <w:tcBorders>
+              <w:top w:val="single" w:color="999999" w:sz="4"/>
+              <w:left w:val="single" w:color="999999" w:sz="4"/>
+              <w:bottom w:val="single" w:color="999999" w:sz="4"/>
+              <w:right w:val="single" w:color="999999" w:sz="4"/>
+            </w:tcBorders>
+            <w:tcMar>
+              <w:top w:type="dxa" w:w="60"/>
+              <w:left w:type="dxa" w:w="100"/>
+              <w:bottom w:type="dxa" w:w="60"/>
+              <w:right w:type="dxa" w:w="100"/>
+            </w:tcMar>
+          </w:tcPr>
+          <w:p>
+            <w:r>
+              <w:t xml:space="preserve">—</w:t>
+            </w:r>
+          </w:p>
+        </w:tc>
+        <w:tc>
+          <w:tcPr>
+            <w:tcW w:type="dxa" w:w="7403"/>
+            <w:tcBorders>
+              <w:top w:val="single" w:color="999999" w:sz="4"/>
+              <w:left w:val="single" w:color="999999" w:sz="4"/>
+              <w:bottom w:val="single" w:color="999999" w:sz="4"/>
+              <w:right w:val="single" w:color="999999" w:sz="4"/>
+            </w:tcBorders>
+            <w:tcMar>
+              <w:top w:type="dxa" w:w="60"/>
+              <w:left w:type="dxa" w:w="100"/>
+              <w:bottom w:type="dxa" w:w="60"/>
+              <w:right w:type="dxa" w:w="100"/>
+            </w:tcMar>
+          </w:tcPr>
+          <w:p>
+            <w:r>
+              <w:t xml:space="preserve">3V3 et INT du module : non câblées</w:t>
+            </w:r>
+          </w:p>
+        </w:tc>
+        <w:tc>
+          <w:tcPr>
+            <w:tcW w:type="dxa" w:w="1676"/>
+            <w:tcBorders>
+              <w:top w:val="single" w:color="999999" w:sz="4"/>
+              <w:left w:val="single" w:color="999999" w:sz="4"/>
+              <w:bottom w:val="single" w:color="999999" w:sz="4"/>
+              <w:right w:val="single" w:color="999999" w:sz="4"/>
+            </w:tcBorders>
+            <w:tcMar>
+              <w:top w:type="dxa" w:w="60"/>
+              <w:left w:type="dxa" w:w="100"/>
+              <w:bottom w:type="dxa" w:w="60"/>
+              <w:right w:type="dxa" w:w="100"/>
+            </w:tcMar>
+          </w:tcPr>
+          <w:p>
+            <w:r>
+              <w:t xml:space="preserve">—</w:t>
+            </w:r>
+          </w:p>
+        </w:tc>
+      </w:tr>
+    </w:tbl>
+    <w:p/>
+    <w:p>
+      <w:pPr>
+        <w:spacing w:after="120"/>
+      </w:pPr>
+      <w:r>
+        <w:t xml:space="preserve">Câble J1 → DHT20 (JST-XH 4 broches, dans l'ordre du module) :</w:t>
+      </w:r>
+    </w:p>
+    <w:tbl>
+      <w:tblPr>
+        <w:tblW w:type="dxa" w:w="9638"/>
+        <w:tblBorders>
+          <w:top w:val="single" w:color="auto" w:sz="4"/>
+          <w:left w:val="single" w:color="auto" w:sz="4"/>
+          <w:bottom w:val="single" w:color="auto" w:sz="4"/>
+          <w:right w:val="single" w:color="auto" w:sz="4"/>
+          <w:insideH w:val="single" w:color="auto" w:sz="4"/>
+          <w:insideV w:val="single" w:color="auto" w:sz="4"/>
+        </w:tblBorders>
+      </w:tblPr>
+      <w:tblGrid>
+        <w:gridCol w:w="1752"/>
+        <w:gridCol w:w="2629"/>
+        <w:gridCol w:w="5257"/>
+      </w:tblGrid>
+      <w:tr>
+        <w:trPr>
+          <w:tblHeader/>
+        </w:trPr>
+        <w:tc>
+          <w:tcPr>
+            <w:tcW w:type="dxa" w:w="1752"/>
+            <w:tcBorders>
+              <w:top w:val="single" w:color="999999" w:sz="4"/>
+              <w:left w:val="single" w:color="999999" w:sz="4"/>
+              <w:bottom w:val="single" w:color="999999" w:sz="4"/>
+              <w:right w:val="single" w:color="999999" w:sz="4"/>
+            </w:tcBorders>
+            <w:shd w:fill="D9E2F3" w:val="clear"/>
+            <w:tcMar>
+              <w:top w:type="dxa" w:w="60"/>
+              <w:left w:type="dxa" w:w="100"/>
+              <w:bottom w:type="dxa" w:w="60"/>
+              <w:right w:type="dxa" w:w="100"/>
+            </w:tcMar>
+          </w:tcPr>
+          <w:p>
+            <w:r>
+              <w:rPr>
+                <w:b/>
+                <w:bCs/>
+              </w:rPr>
+              <w:t xml:space="preserve">J1</w:t>
+            </w:r>
+          </w:p>
+        </w:tc>
+        <w:tc>
+          <w:tcPr>
+            <w:tcW w:type="dxa" w:w="2629"/>
+            <w:tcBorders>
+              <w:top w:val="single" w:color="999999" w:sz="4"/>
+              <w:left w:val="single" w:color="999999" w:sz="4"/>
+              <w:bottom w:val="single" w:color="999999" w:sz="4"/>
+              <w:right w:val="single" w:color="999999" w:sz="4"/>
+            </w:tcBorders>
+            <w:shd w:fill="D9E2F3" w:val="clear"/>
+            <w:tcMar>
+              <w:top w:type="dxa" w:w="60"/>
+              <w:left w:type="dxa" w:w="100"/>
+              <w:bottom w:type="dxa" w:w="60"/>
+              <w:right w:type="dxa" w:w="100"/>
+            </w:tcMar>
+          </w:tcPr>
+          <w:p>
+            <w:r>
+              <w:rPr>
+                <w:b/>
+                <w:bCs/>
+              </w:rPr>
+              <w:t xml:space="preserve">Module</w:t>
+            </w:r>
+          </w:p>
+        </w:tc>
+        <w:tc>
+          <w:tcPr>
+            <w:tcW w:type="dxa" w:w="5257"/>
+            <w:tcBorders>
+              <w:top w:val="single" w:color="999999" w:sz="4"/>
+              <w:left w:val="single" w:color="999999" w:sz="4"/>
+              <w:bottom w:val="single" w:color="999999" w:sz="4"/>
+              <w:right w:val="single" w:color="999999" w:sz="4"/>
+            </w:tcBorders>
+            <w:shd w:fill="D9E2F3" w:val="clear"/>
+            <w:tcMar>
+              <w:top w:type="dxa" w:w="60"/>
+              <w:left w:type="dxa" w:w="100"/>
+              <w:bottom w:type="dxa" w:w="60"/>
+              <w:right w:type="dxa" w:w="100"/>
+            </w:tcMar>
+          </w:tcPr>
+          <w:p>
+            <w:r>
+              <w:rPr>
+                <w:b/>
+                <w:bCs/>
+              </w:rPr>
+              <w:t xml:space="preserve">Torsadé avec</w:t>
+            </w:r>
+          </w:p>
+        </w:tc>
+      </w:tr>
+      <w:tr>
+        <w:trPr>
+          <w:tblHeader w:val="off"/>
+        </w:trPr>
+        <w:tc>
+          <w:tcPr>
+            <w:tcW w:type="dxa" w:w="1752"/>
+            <w:tcBorders>
+              <w:top w:val="single" w:color="999999" w:sz="4"/>
+              <w:left w:val="single" w:color="999999" w:sz="4"/>
+              <w:bottom w:val="single" w:color="999999" w:sz="4"/>
+              <w:right w:val="single" w:color="999999" w:sz="4"/>
+            </w:tcBorders>
+            <w:tcMar>
+              <w:top w:type="dxa" w:w="60"/>
+              <w:left w:type="dxa" w:w="100"/>
+              <w:bottom w:type="dxa" w:w="60"/>
+              <w:right w:type="dxa" w:w="100"/>
+            </w:tcMar>
+          </w:tcPr>
+          <w:p>
+            <w:r>
+              <w:t xml:space="preserve">1</w:t>
+            </w:r>
+          </w:p>
+        </w:tc>
+        <w:tc>
+          <w:tcPr>
+            <w:tcW w:type="dxa" w:w="2629"/>
+            <w:tcBorders>
+              <w:top w:val="single" w:color="999999" w:sz="4"/>
+              <w:left w:val="single" w:color="999999" w:sz="4"/>
+              <w:bottom w:val="single" w:color="999999" w:sz="4"/>
+              <w:right w:val="single" w:color="999999" w:sz="4"/>
+            </w:tcBorders>
+            <w:tcMar>
+              <w:top w:type="dxa" w:w="60"/>
+              <w:left w:type="dxa" w:w="100"/>
+              <w:bottom w:type="dxa" w:w="60"/>
+              <w:right w:type="dxa" w:w="100"/>
+            </w:tcMar>
+          </w:tcPr>
+          <w:p>
+            <w:r>
+              <w:t xml:space="preserve">+</w:t>
+            </w:r>
+          </w:p>
+        </w:tc>
+        <w:tc>
+          <w:tcPr>
+            <w:tcW w:type="dxa" w:w="5257"/>
+            <w:tcBorders>
+              <w:top w:val="single" w:color="999999" w:sz="4"/>
+              <w:left w:val="single" w:color="999999" w:sz="4"/>
+              <w:bottom w:val="single" w:color="999999" w:sz="4"/>
+              <w:right w:val="single" w:color="999999" w:sz="4"/>
+            </w:tcBorders>
+            <w:tcMar>
+              <w:top w:type="dxa" w:w="60"/>
+              <w:left w:type="dxa" w:w="100"/>
+              <w:bottom w:type="dxa" w:w="60"/>
+              <w:right w:type="dxa" w:w="100"/>
+            </w:tcMar>
+          </w:tcPr>
+          <w:p>
+            <w:r>
+              <w:t xml:space="preserve">SCL</w:t>
+            </w:r>
+          </w:p>
+        </w:tc>
+      </w:tr>
+      <w:tr>
+        <w:trPr>
+          <w:tblHeader w:val="off"/>
+        </w:trPr>
+        <w:tc>
+          <w:tcPr>
+            <w:tcW w:type="dxa" w:w="1752"/>
+            <w:tcBorders>
+              <w:top w:val="single" w:color="999999" w:sz="4"/>
+              <w:left w:val="single" w:color="999999" w:sz="4"/>
+              <w:bottom w:val="single" w:color="999999" w:sz="4"/>
+              <w:right w:val="single" w:color="999999" w:sz="4"/>
+            </w:tcBorders>
+            <w:tcMar>
+              <w:top w:type="dxa" w:w="60"/>
+              <w:left w:type="dxa" w:w="100"/>
+              <w:bottom w:type="dxa" w:w="60"/>
+              <w:right w:type="dxa" w:w="100"/>
+            </w:tcMar>
+          </w:tcPr>
+          <w:p>
+            <w:r>
+              <w:t xml:space="preserve">2</w:t>
+            </w:r>
+          </w:p>
+        </w:tc>
+        <w:tc>
+          <w:tcPr>
+            <w:tcW w:type="dxa" w:w="2629"/>
+            <w:tcBorders>
+              <w:top w:val="single" w:color="999999" w:sz="4"/>
+              <w:left w:val="single" w:color="999999" w:sz="4"/>
+              <w:bottom w:val="single" w:color="999999" w:sz="4"/>
+              <w:right w:val="single" w:color="999999" w:sz="4"/>
+            </w:tcBorders>
+            <w:tcMar>
+              <w:top w:type="dxa" w:w="60"/>
+              <w:left w:type="dxa" w:w="100"/>
+              <w:bottom w:type="dxa" w:w="60"/>
+              <w:right w:type="dxa" w:w="100"/>
+            </w:tcMar>
+          </w:tcPr>
+          <w:p>
+            <w:r>
+              <w:t xml:space="preserve">−</w:t>
+            </w:r>
+          </w:p>
+        </w:tc>
+        <w:tc>
+          <w:tcPr>
+            <w:tcW w:type="dxa" w:w="5257"/>
+            <w:tcBorders>
+              <w:top w:val="single" w:color="999999" w:sz="4"/>
+              <w:left w:val="single" w:color="999999" w:sz="4"/>
+              <w:bottom w:val="single" w:color="999999" w:sz="4"/>
+              <w:right w:val="single" w:color="999999" w:sz="4"/>
+            </w:tcBorders>
+            <w:tcMar>
+              <w:top w:type="dxa" w:w="60"/>
+              <w:left w:type="dxa" w:w="100"/>
+              <w:bottom w:type="dxa" w:w="60"/>
+              <w:right w:type="dxa" w:w="100"/>
+            </w:tcMar>
+          </w:tcPr>
+          <w:p>
+            <w:r>
+              <w:t xml:space="preserve">SDA</w:t>
+            </w:r>
+          </w:p>
+        </w:tc>
+      </w:tr>
+      <w:tr>
+        <w:trPr>
+          <w:tblHeader w:val="off"/>
+        </w:trPr>
+        <w:tc>
+          <w:tcPr>
+            <w:tcW w:type="dxa" w:w="1752"/>
+            <w:tcBorders>
+              <w:top w:val="single" w:color="999999" w:sz="4"/>
+              <w:left w:val="single" w:color="999999" w:sz="4"/>
+              <w:bottom w:val="single" w:color="999999" w:sz="4"/>
+              <w:right w:val="single" w:color="999999" w:sz="4"/>
+            </w:tcBorders>
+            <w:tcMar>
+              <w:top w:type="dxa" w:w="60"/>
+              <w:left w:type="dxa" w:w="100"/>
+              <w:bottom w:type="dxa" w:w="60"/>
+              <w:right w:type="dxa" w:w="100"/>
+            </w:tcMar>
+          </w:tcPr>
+          <w:p>
+            <w:r>
+              <w:t xml:space="preserve">3</w:t>
+            </w:r>
+          </w:p>
+        </w:tc>
+        <w:tc>
+          <w:tcPr>
+            <w:tcW w:type="dxa" w:w="2629"/>
+            <w:tcBorders>
+              <w:top w:val="single" w:color="999999" w:sz="4"/>
+              <w:left w:val="single" w:color="999999" w:sz="4"/>
+              <w:bottom w:val="single" w:color="999999" w:sz="4"/>
+              <w:right w:val="single" w:color="999999" w:sz="4"/>
+            </w:tcBorders>
+            <w:tcMar>
+              <w:top w:type="dxa" w:w="60"/>
+              <w:left w:type="dxa" w:w="100"/>
+              <w:bottom w:type="dxa" w:w="60"/>
+              <w:right w:type="dxa" w:w="100"/>
+            </w:tcMar>
+          </w:tcPr>
+          <w:p>
+            <w:r>
+              <w:t xml:space="preserve">SCL</w:t>
+            </w:r>
+          </w:p>
+        </w:tc>
+        <w:tc>
+          <w:tcPr>
+            <w:tcW w:type="dxa" w:w="5257"/>
+            <w:tcBorders>
+              <w:top w:val="single" w:color="999999" w:sz="4"/>
+              <w:left w:val="single" w:color="999999" w:sz="4"/>
+              <w:bottom w:val="single" w:color="999999" w:sz="4"/>
+              <w:right w:val="single" w:color="999999" w:sz="4"/>
+            </w:tcBorders>
+            <w:tcMar>
+              <w:top w:type="dxa" w:w="60"/>
+              <w:left w:type="dxa" w:w="100"/>
+              <w:bottom w:type="dxa" w:w="60"/>
+              <w:right w:type="dxa" w:w="100"/>
+            </w:tcMar>
+          </w:tcPr>
+          <w:p>
+            <w:r>
+              <w:t xml:space="preserve">+</w:t>
+            </w:r>
+          </w:p>
+        </w:tc>
+      </w:tr>
+      <w:tr>
+        <w:trPr>
+          <w:tblHeader w:val="off"/>
+        </w:trPr>
+        <w:tc>
+          <w:tcPr>
+            <w:tcW w:type="dxa" w:w="1752"/>
+            <w:tcBorders>
+              <w:top w:val="single" w:color="999999" w:sz="4"/>
+              <w:left w:val="single" w:color="999999" w:sz="4"/>
+              <w:bottom w:val="single" w:color="999999" w:sz="4"/>
+              <w:right w:val="single" w:color="999999" w:sz="4"/>
+            </w:tcBorders>
+            <w:tcMar>
+              <w:top w:type="dxa" w:w="60"/>
+              <w:left w:type="dxa" w:w="100"/>
+              <w:bottom w:type="dxa" w:w="60"/>
+              <w:right w:type="dxa" w:w="100"/>
+            </w:tcMar>
+          </w:tcPr>
+          <w:p>
+            <w:r>
+              <w:t xml:space="preserve">4</w:t>
+            </w:r>
+          </w:p>
+        </w:tc>
+        <w:tc>
+          <w:tcPr>
+            <w:tcW w:type="dxa" w:w="2629"/>
+            <w:tcBorders>
+              <w:top w:val="single" w:color="999999" w:sz="4"/>
+              <w:left w:val="single" w:color="999999" w:sz="4"/>
+              <w:bottom w:val="single" w:color="999999" w:sz="4"/>
+              <w:right w:val="single" w:color="999999" w:sz="4"/>
+            </w:tcBorders>
+            <w:tcMar>
+              <w:top w:type="dxa" w:w="60"/>
+              <w:left w:type="dxa" w:w="100"/>
+              <w:bottom w:type="dxa" w:w="60"/>
+              <w:right w:type="dxa" w:w="100"/>
+            </w:tcMar>
+          </w:tcPr>
+          <w:p>
+            <w:r>
+              <w:t xml:space="preserve">SDA</w:t>
+            </w:r>
+          </w:p>
+        </w:tc>
+        <w:tc>
+          <w:tcPr>
+            <w:tcW w:type="dxa" w:w="5257"/>
+            <w:tcBorders>
+              <w:top w:val="single" w:color="999999" w:sz="4"/>
+              <w:left w:val="single" w:color="999999" w:sz="4"/>
+              <w:bottom w:val="single" w:color="999999" w:sz="4"/>
+              <w:right w:val="single" w:color="999999" w:sz="4"/>
+            </w:tcBorders>
+            <w:tcMar>
+              <w:top w:type="dxa" w:w="60"/>
+              <w:left w:type="dxa" w:w="100"/>
+              <w:bottom w:type="dxa" w:w="60"/>
+              <w:right w:type="dxa" w:w="100"/>
+            </w:tcMar>
+          </w:tcPr>
+          <w:p>
+            <w:r>
+              <w:t xml:space="preserve">−</w:t>
+            </w:r>
+          </w:p>
+        </w:tc>
+      </w:tr>
+    </w:tbl>
+    <w:p/>
     <w:p>
       <w:pPr>
         <w:pStyle w:val="Heading1"/>
@@ -6399,6 +7540,12 @@
       <w:startOverride w:val="1"/>
     </w:lvlOverride>
     <w:lvlOverride w:ilvl="1">
+      <w:startOverride w:val="1"/>
+    </w:lvlOverride>
+  </w:num>
+  <w:num w:numId="3">
+    <w:abstractNumId w:val="3"/>
+    <w:lvlOverride w:ilvl="0">
       <w:startOverride w:val="1"/>
     </w:lvlOverride>
   </w:num>

</xml_diff>